<commit_message>
feat: Update GenAI Transparency Log with additional entries and insights from AI implementation
</commit_message>
<xml_diff>
--- a/report/DataX_report.docx
+++ b/report/DataX_report.docx
@@ -183,6 +183,35 @@
                 <w:b/>
                 <w:sz w:val="18"/>
               </w:rPr>
+              <w:t>Outlets recovered via Lat/Lon swap fix</w:t>
+            </w:r>
+          </w:p>
+        </w:tc>
+        <w:tc>
+          <w:tcPr>
+            <w:tcW w:type="dxa" w:w="6803"/>
+          </w:tcPr>
+          <w:p>
+            <w:r>
+              <w:rPr>
+                <w:sz w:val="18"/>
+              </w:rPr>
+              <w:t>200 (additional forensic win)</w:t>
+            </w:r>
+          </w:p>
+        </w:tc>
+      </w:tr>
+      <w:tr>
+        <w:tc>
+          <w:tcPr>
+            <w:tcW w:type="dxa" w:w="2551"/>
+          </w:tcPr>
+          <w:p>
+            <w:r>
+              <w:rPr>
+                <w:b/>
+                <w:sz w:val="18"/>
+              </w:rPr>
               <w:t>POIs scraped from OpenStreetMap</w:t>
             </w:r>
           </w:p>
@@ -196,7 +225,36 @@
               <w:rPr>
                 <w:sz w:val="18"/>
               </w:rPr>
-              <w:t>32,246 across 16 tag types</w:t>
+              <w:t>39,616 across 26 tag types</w:t>
+            </w:r>
+          </w:p>
+        </w:tc>
+      </w:tr>
+      <w:tr>
+        <w:tc>
+          <w:tcPr>
+            <w:tcW w:type="dxa" w:w="2551"/>
+          </w:tcPr>
+          <w:p>
+            <w:r>
+              <w:rPr>
+                <w:b/>
+                <w:sz w:val="18"/>
+              </w:rPr>
+              <w:t>Engineered features per outlet</w:t>
+            </w:r>
+          </w:p>
+        </w:tc>
+        <w:tc>
+          <w:tcPr>
+            <w:tcW w:type="dxa" w:w="6803"/>
+          </w:tcPr>
+          <w:p>
+            <w:r>
+              <w:rPr>
+                <w:sz w:val="18"/>
+              </w:rPr>
+              <w:t>147 (incl. 76 POI-density + 7 SKU-mix)</w:t>
             </w:r>
           </w:p>
         </w:tc>
@@ -241,7 +299,7 @@
                 <w:b/>
                 <w:sz w:val="18"/>
               </w:rPr>
-              <w:t>Cross-check Spearman ρ (peer-Q90 vs log-linear)</w:t>
+              <w:t>Method convergence (peer-Q90 / log-linear / Tobit)</w:t>
             </w:r>
           </w:p>
         </w:tc>
@@ -254,7 +312,7 @@
               <w:rPr>
                 <w:sz w:val="18"/>
               </w:rPr>
-              <w:t>0.889</w:t>
+              <w:t>ρ = 0.86 / 0.83 / 0.93</w:t>
             </w:r>
           </w:p>
         </w:tc>
@@ -283,7 +341,36 @@
               <w:rPr>
                 <w:sz w:val="18"/>
               </w:rPr>
-              <w:t>0.6 peer-Q90 + 0.4 log-linear</w:t>
+              <w:t>0.50 peer-Q90 + 0.25 log-linear + 0.25 Tobit</w:t>
+            </w:r>
+          </w:p>
+        </w:tc>
+      </w:tr>
+      <w:tr>
+        <w:tc>
+          <w:tcPr>
+            <w:tcW w:type="dxa" w:w="2551"/>
+          </w:tcPr>
+          <w:p>
+            <w:r>
+              <w:rPr>
+                <w:b/>
+                <w:sz w:val="18"/>
+              </w:rPr>
+              <w:t>Hold-out validation (Jan 2025, n=11,169)</w:t>
+            </w:r>
+          </w:p>
+        </w:tc>
+        <w:tc>
+          <w:tcPr>
+            <w:tcW w:type="dxa" w:w="6803"/>
+          </w:tcPr>
+          <w:p>
+            <w:r>
+              <w:rPr>
+                <w:sz w:val="18"/>
+              </w:rPr>
+              <w:t>Spearman ρ = 0.805</w:t>
             </w:r>
           </w:p>
         </w:tc>
@@ -312,7 +399,7 @@
               <w:rPr>
                 <w:sz w:val="18"/>
               </w:rPr>
-              <w:t>181.0 L / 306.8 L</w:t>
+              <w:t>171.1 L / 293.8 L</w:t>
             </w:r>
           </w:p>
         </w:tc>
@@ -570,7 +657,7 @@
               <w:rPr>
                 <w:sz w:val="16"/>
               </w:rPr>
-              <w:t>19564</w:t>
+              <w:t>19764</w:t>
             </w:r>
           </w:p>
         </w:tc>
@@ -583,7 +670,7 @@
               <w:rPr>
                 <w:sz w:val="16"/>
               </w:rPr>
-              <w:t>436</w:t>
+              <w:t>236</w:t>
             </w:r>
           </w:p>
         </w:tc>
@@ -596,7 +683,7 @@
               <w:rPr>
                 <w:sz w:val="16"/>
               </w:rPr>
-              <w:t>97.8200</w:t>
+              <w:t>98.8200</w:t>
             </w:r>
           </w:p>
         </w:tc>
@@ -879,252 +966,6 @@
               <w:rPr>
                 <w:sz w:val="16"/>
               </w:rPr>
-              <w:t>Cross-file Outlet_ID integrity</w:t>
-            </w:r>
-          </w:p>
-        </w:tc>
-        <w:tc>
-          <w:tcPr>
-            <w:tcW w:type="dxa" w:w="3400"/>
-          </w:tcPr>
-          <w:p>
-            <w:r>
-              <w:rPr>
-                <w:sz w:val="16"/>
-              </w:rPr>
-              <w:t>0</w:t>
-            </w:r>
-          </w:p>
-        </w:tc>
-        <w:tc>
-          <w:tcPr>
-            <w:tcW w:type="dxa" w:w="3400"/>
-          </w:tcPr>
-          <w:p>
-            <w:r>
-              <w:rPr>
-                <w:sz w:val="16"/>
-              </w:rPr>
-              <w:t>reported_clean</w:t>
-            </w:r>
-          </w:p>
-        </w:tc>
-      </w:tr>
-      <w:tr>
-        <w:tc>
-          <w:tcPr>
-            <w:tcW w:type="dxa" w:w="3400"/>
-          </w:tcPr>
-          <w:p>
-            <w:r>
-              <w:rPr>
-                <w:sz w:val="16"/>
-              </w:rPr>
-              <w:t>Outlet_Type typos normalised</w:t>
-            </w:r>
-          </w:p>
-        </w:tc>
-        <w:tc>
-          <w:tcPr>
-            <w:tcW w:type="dxa" w:w="3400"/>
-          </w:tcPr>
-          <w:p>
-            <w:r>
-              <w:rPr>
-                <w:sz w:val="16"/>
-              </w:rPr>
-              <w:t>585</w:t>
-            </w:r>
-          </w:p>
-        </w:tc>
-        <w:tc>
-          <w:tcPr>
-            <w:tcW w:type="dxa" w:w="3400"/>
-          </w:tcPr>
-          <w:p>
-            <w:r>
-              <w:rPr>
-                <w:sz w:val="16"/>
-              </w:rPr>
-              <w:t>cleaned</w:t>
-            </w:r>
-          </w:p>
-        </w:tc>
-      </w:tr>
-      <w:tr>
-        <w:tc>
-          <w:tcPr>
-            <w:tcW w:type="dxa" w:w="3400"/>
-          </w:tcPr>
-          <w:p>
-            <w:r>
-              <w:rPr>
-                <w:sz w:val="16"/>
-              </w:rPr>
-              <w:t>Transaction value classification</w:t>
-            </w:r>
-          </w:p>
-        </w:tc>
-        <w:tc>
-          <w:tcPr>
-            <w:tcW w:type="dxa" w:w="3400"/>
-          </w:tcPr>
-          <w:p>
-            <w:r>
-              <w:rPr>
-                <w:sz w:val="16"/>
-              </w:rPr>
-              <w:t>0</w:t>
-            </w:r>
-          </w:p>
-        </w:tc>
-        <w:tc>
-          <w:tcPr>
-            <w:tcW w:type="dxa" w:w="3400"/>
-          </w:tcPr>
-          <w:p>
-            <w:r>
-              <w:rPr>
-                <w:sz w:val="16"/>
-              </w:rPr>
-              <w:t>cleaned_and_flagged</w:t>
-            </w:r>
-          </w:p>
-        </w:tc>
-      </w:tr>
-      <w:tr>
-        <w:tc>
-          <w:tcPr>
-            <w:tcW w:type="dxa" w:w="3400"/>
-          </w:tcPr>
-          <w:p>
-            <w:r>
-              <w:rPr>
-                <w:sz w:val="16"/>
-              </w:rPr>
-              <w:t>Codebook references absent column</w:t>
-            </w:r>
-          </w:p>
-        </w:tc>
-        <w:tc>
-          <w:tcPr>
-            <w:tcW w:type="dxa" w:w="3400"/>
-          </w:tcPr>
-          <w:p>
-            <w:r>
-              <w:rPr>
-                <w:sz w:val="16"/>
-              </w:rPr>
-              <w:t>1</w:t>
-            </w:r>
-          </w:p>
-        </w:tc>
-        <w:tc>
-          <w:tcPr>
-            <w:tcW w:type="dxa" w:w="3400"/>
-          </w:tcPr>
-          <w:p>
-            <w:r>
-              <w:rPr>
-                <w:sz w:val="16"/>
-              </w:rPr>
-              <w:t>flagged</w:t>
-            </w:r>
-          </w:p>
-        </w:tc>
-      </w:tr>
-      <w:tr>
-        <w:tc>
-          <w:tcPr>
-            <w:tcW w:type="dxa" w:w="3400"/>
-          </w:tcPr>
-          <w:p>
-            <w:r>
-              <w:rPr>
-                <w:sz w:val="16"/>
-              </w:rPr>
-              <w:t>Codebook filename divergence</w:t>
-            </w:r>
-          </w:p>
-        </w:tc>
-        <w:tc>
-          <w:tcPr>
-            <w:tcW w:type="dxa" w:w="3400"/>
-          </w:tcPr>
-          <w:p>
-            <w:r>
-              <w:rPr>
-                <w:sz w:val="16"/>
-              </w:rPr>
-              <w:t>1</w:t>
-            </w:r>
-          </w:p>
-        </w:tc>
-        <w:tc>
-          <w:tcPr>
-            <w:tcW w:type="dxa" w:w="3400"/>
-          </w:tcPr>
-          <w:p>
-            <w:r>
-              <w:rPr>
-                <w:sz w:val="16"/>
-              </w:rPr>
-              <w:t>flagged</w:t>
-            </w:r>
-          </w:p>
-        </w:tc>
-      </w:tr>
-      <w:tr>
-        <w:tc>
-          <w:tcPr>
-            <w:tcW w:type="dxa" w:w="3400"/>
-          </w:tcPr>
-          <w:p>
-            <w:r>
-              <w:rPr>
-                <w:sz w:val="16"/>
-              </w:rPr>
-              <w:t>Automated-entry signatures</w:t>
-            </w:r>
-          </w:p>
-        </w:tc>
-        <w:tc>
-          <w:tcPr>
-            <w:tcW w:type="dxa" w:w="3400"/>
-          </w:tcPr>
-          <w:p>
-            <w:r>
-              <w:rPr>
-                <w:sz w:val="16"/>
-              </w:rPr>
-              <w:t>0</w:t>
-            </w:r>
-          </w:p>
-        </w:tc>
-        <w:tc>
-          <w:tcPr>
-            <w:tcW w:type="dxa" w:w="3400"/>
-          </w:tcPr>
-          <w:p>
-            <w:r>
-              <w:rPr>
-                <w:sz w:val="16"/>
-              </w:rPr>
-              <w:t>none_found</w:t>
-            </w:r>
-          </w:p>
-        </w:tc>
-      </w:tr>
-      <w:tr>
-        <w:tc>
-          <w:tcPr>
-            <w:tcW w:type="dxa" w:w="3400"/>
-          </w:tcPr>
-          <w:p>
-            <w:r>
-              <w:rPr>
-                <w:sz w:val="16"/>
-              </w:rPr>
               <w:t>Stockout months (zero sandwiched between non-zero)</w:t>
             </w:r>
           </w:p>
@@ -1138,7 +979,7 @@
               <w:rPr>
                 <w:sz w:val="16"/>
               </w:rPr>
-              <w:t>81165</w:t>
+              <w:t>82036</w:t>
             </w:r>
           </w:p>
         </w:tc>
@@ -1179,7 +1020,7 @@
               <w:rPr>
                 <w:sz w:val="16"/>
               </w:rPr>
-              <w:t>2704</w:t>
+              <w:t>2730</w:t>
             </w:r>
           </w:p>
         </w:tc>
@@ -1405,6 +1246,34 @@
               <w:rPr>
                 <w:sz w:val="16"/>
               </w:rPr>
+              <w:t>landuse=residential</w:t>
+            </w:r>
+          </w:p>
+        </w:tc>
+        <w:tc>
+          <w:tcPr>
+            <w:tcW w:type="dxa" w:w="5100"/>
+          </w:tcPr>
+          <w:p>
+            <w:r>
+              <w:rPr>
+                <w:sz w:val="16"/>
+              </w:rPr>
+              <w:t>4764</w:t>
+            </w:r>
+          </w:p>
+        </w:tc>
+      </w:tr>
+      <w:tr>
+        <w:tc>
+          <w:tcPr>
+            <w:tcW w:type="dxa" w:w="5100"/>
+          </w:tcPr>
+          <w:p>
+            <w:r>
+              <w:rPr>
+                <w:sz w:val="16"/>
+              </w:rPr>
               <w:t>highway=bus_stop</w:t>
             </w:r>
           </w:p>
@@ -1601,6 +1470,34 @@
               <w:rPr>
                 <w:sz w:val="16"/>
               </w:rPr>
+              <w:t>amenity=cafe</w:t>
+            </w:r>
+          </w:p>
+        </w:tc>
+        <w:tc>
+          <w:tcPr>
+            <w:tcW w:type="dxa" w:w="5100"/>
+          </w:tcPr>
+          <w:p>
+            <w:r>
+              <w:rPr>
+                <w:sz w:val="16"/>
+              </w:rPr>
+              <w:t>917</w:t>
+            </w:r>
+          </w:p>
+        </w:tc>
+      </w:tr>
+      <w:tr>
+        <w:tc>
+          <w:tcPr>
+            <w:tcW w:type="dxa" w:w="5100"/>
+          </w:tcPr>
+          <w:p>
+            <w:r>
+              <w:rPr>
+                <w:sz w:val="16"/>
+              </w:rPr>
               <w:t>amenity=hospital</w:t>
             </w:r>
           </w:p>
@@ -1685,6 +1582,34 @@
               <w:rPr>
                 <w:sz w:val="16"/>
               </w:rPr>
+              <w:t>amenity=fast_food</w:t>
+            </w:r>
+          </w:p>
+        </w:tc>
+        <w:tc>
+          <w:tcPr>
+            <w:tcW w:type="dxa" w:w="5100"/>
+          </w:tcPr>
+          <w:p>
+            <w:r>
+              <w:rPr>
+                <w:sz w:val="16"/>
+              </w:rPr>
+              <w:t>472</w:t>
+            </w:r>
+          </w:p>
+        </w:tc>
+      </w:tr>
+      <w:tr>
+        <w:tc>
+          <w:tcPr>
+            <w:tcW w:type="dxa" w:w="5100"/>
+          </w:tcPr>
+          <w:p>
+            <w:r>
+              <w:rPr>
+                <w:sz w:val="16"/>
+              </w:rPr>
               <w:t>tourism=attraction</w:t>
             </w:r>
           </w:p>
@@ -1698,7 +1623,7 @@
               <w:rPr>
                 <w:sz w:val="16"/>
               </w:rPr>
-              <w:t>403</w:t>
+              <w:t>406</w:t>
             </w:r>
           </w:p>
         </w:tc>
@@ -1741,7 +1666,7 @@
               <w:rPr>
                 <w:sz w:val="16"/>
               </w:rPr>
-              <w:t>shop=alcohol</w:t>
+              <w:t>amenity=clinic</w:t>
             </w:r>
           </w:p>
         </w:tc>
@@ -1754,7 +1679,7 @@
               <w:rPr>
                 <w:sz w:val="16"/>
               </w:rPr>
-              <w:t>203</w:t>
+              <w:t>332</w:t>
             </w:r>
           </w:p>
         </w:tc>
@@ -1769,7 +1694,7 @@
               <w:rPr>
                 <w:sz w:val="16"/>
               </w:rPr>
-              <w:t>amenity=university</w:t>
+              <w:t>amenity=kindergarten</w:t>
             </w:r>
           </w:p>
         </w:tc>
@@ -1782,7 +1707,35 @@
               <w:rPr>
                 <w:sz w:val="16"/>
               </w:rPr>
-              <w:t>144</w:t>
+              <w:t>305</w:t>
+            </w:r>
+          </w:p>
+        </w:tc>
+      </w:tr>
+      <w:tr>
+        <w:tc>
+          <w:tcPr>
+            <w:tcW w:type="dxa" w:w="5100"/>
+          </w:tcPr>
+          <w:p>
+            <w:r>
+              <w:rPr>
+                <w:sz w:val="16"/>
+              </w:rPr>
+              <w:t>amenity=college</w:t>
+            </w:r>
+          </w:p>
+        </w:tc>
+        <w:tc>
+          <w:tcPr>
+            <w:tcW w:type="dxa" w:w="5100"/>
+          </w:tcPr>
+          <w:p>
+            <w:r>
+              <w:rPr>
+                <w:sz w:val="16"/>
+              </w:rPr>
+              <w:t>267</w:t>
             </w:r>
           </w:p>
         </w:tc>
@@ -1838,7 +1791,7 @@
         <w:rPr>
           <w:color w:val="1A3A6B"/>
         </w:rPr>
-        <w:t>Framework (4 steps)</w:t>
+        <w:t>Framework (5 steps)</w:t>
       </w:r>
     </w:p>
     <w:p>
@@ -1851,7 +1804,7 @@
           <w:i w:val="0"/>
           <w:sz w:val="18"/>
         </w:rPr>
-        <w:t>Step A - Constraint detection (OR of three rules): (i) zero-volume month with positive neighbours (stockout signature); (ii) zero-volume month in an outlet that has any positive month (intermittent supply); (iii) Cooler_Count = 0 with zero_months_share &gt; 0.30 (infrastructure-limited).</w:t>
+        <w:t>Step A - Constraint detection (OR of four rules): (i) zero-volume month with positive neighbours (stockout signature); (ii) zero-volume month in an outlet that has any positive month (intermittent supply); (iii) Cooler_Count = 0 with zero_months_share &gt; 0.30 (infrastructure-limited); (iv) Cooler_Count = 0 AND monthly_volume below outlet's own Q90 / 3 (suppressed cold-storage outlet operating at one-third of its own ceiling).</w:t>
       </w:r>
     </w:p>
     <w:p>
@@ -1864,7 +1817,7 @@
           <w:i w:val="0"/>
           <w:sz w:val="18"/>
         </w:rPr>
-        <w:t>Step B - Peer-conditional Q90 ceiling. Group outlets by (Outlet_Type × Size × Province × poi_tier) and compute the 90th-percentile monthly volume across unconstrained outlet-months. Hierarchical fallback (Type×Size×Province×Tier → Type×Size×Province → Type×Size → Type → Global) when a cohort has fewer than 30 unconstrained observations. Each outlet's base potential = max( own Q90 of unconstrained months, peer-cohort Q90 ).</w:t>
+        <w:t>Step B - Peer-conditional Q90 ceiling. Group outlets by (Outlet_Type × Size × Province × poi_tier) using 4 POI rings (0.5, 1, 2, 5 km) for catchment definition. 99.9% of outlets resolve at the finest level. Each outlet's base potential = max( own Q90 of unconstrained months, peer-cohort Q90 ). Hierarchical fallback to coarser cohorts triggers when n&lt;30.</w:t>
       </w:r>
     </w:p>
     <w:p>
@@ -1877,7 +1830,7 @@
           <w:i w:val="0"/>
           <w:sz w:val="18"/>
         </w:rPr>
-        <w:t>Step C - Projection: P̂(Jan 2026) = base × m(distributor, Jan 2026) × g(distributor) × h(Jan 2026). m is the distributor-specific seasonality multiplier calibrated empirically from the categorical Seasonality_Index (e.g., 'Favorable' → 1.30-1.43× baseline; 'Un-Favorable' → 0.59-0.65×). g is the geometric mean of Jan-over-Jan growth per distributor, clipped to [0.85, 1.30]. h is a holiday-count adjustment that compares 2026 January's known fixed/lunar holidays (Duruthu Poya, Tamil Thai Pongal) against the historical Jan average. Sanity bounds: floor = Q95 of own history; ceiling = 5 × peer cohort Q90.</w:t>
+        <w:t>Step C - Projection: P̂(Jan 2026) = base × m × g × h. m is the distributor-specific seasonality multiplier calibrated empirically from the categorical Seasonality_Index ('Favorable' → 1.30-1.43× baseline; 'Un-Favorable' → 0.59-0.65×). g is the geometric mean of Jan-over-Jan growth per distributor, clipped to [0.85, 1.30]. h is a holiday-count adjustment using known fixed/lunar Jan 2026 holidays (Duruthu Poya, Tamil Thai Pongal). Sanity bounds: floor = Q95 of own history; ceiling = 5 × peer cohort Q90.</w:t>
       </w:r>
     </w:p>
     <w:p>
@@ -1890,7 +1843,20 @@
           <w:i w:val="0"/>
           <w:sz w:val="18"/>
         </w:rPr>
-        <w:t>Step D - Cross-check via log-linear regression on the unconstrained subset. We fit OLS on log(1 + monthly_volume) using outlet attributes (Type, Size, Province, POI density, Cooler_Count, coordinates) only on unconstrained outlet-months - a complete-case censored-regression proxy (Tobin 1958; Greene 2008). Predictions are exp-transformed and projected with the same Jan 2026 multipliers, then compared to peer-Q90 by Spearman ρ. When ρ ≥ 0.75 we blend final = 0.6·peer-Q90 + 0.4·log-linear; otherwise peer-Q90 alone (with honest disclosure in this report).</w:t>
+        <w:t>Step D - First cross-check: log-linear regression on the unconstrained subset. OLS on log(1 + monthly_volume) using outlet attributes, SKU-mix features (avg price, premium / mid / mass share), POI density, Cooler_Count, coordinates. A complete-case censored regression proxy following Tobin 1958 and Greene 2008.</w:t>
+      </w:r>
+    </w:p>
+    <w:p>
+      <w:pPr>
+        <w:spacing w:after="80"/>
+      </w:pPr>
+      <w:r>
+        <w:rPr>
+          <w:b w:val="0"/>
+          <w:i w:val="0"/>
+          <w:sz w:val="18"/>
+        </w:rPr>
+        <w:t>Step E - Second cross-check: full Tobit Type I maximum likelihood with right-censoring at the observed value for constrained months. Fitted via L-BFGS-B on the joint log-likelihood combining log-normal pdf for uncensored observations and log survival function for censored. When all three Spearman ρ pairs exceed 0.75, we blend the methods with weights 0.50 peer-Q90 + 0.25 log-linear + 0.25 Tobit. Observed convergence on this submission: ρ(peer, log-linear) = 0.86, ρ(peer, Tobit) = 0.83, ρ(log-linear, Tobit) = 0.93 — all above threshold.</w:t>
       </w:r>
     </w:p>
     <w:p>
@@ -1901,7 +1867,7 @@
         <w:rPr>
           <w:color w:val="1A3A6B"/>
         </w:rPr>
-        <w:t>Internal Consistency (no held-out y, so we validate stability)</w:t>
+        <w:t>Internal Consistency + Hold-Out Validation</w:t>
       </w:r>
     </w:p>
     <w:tbl>
@@ -1967,7 +1933,7 @@
               <w:rPr>
                 <w:sz w:val="16"/>
               </w:rPr>
-              <w:t>13,847 of 19,564 outlets</w:t>
+              <w:t>13,999 of 19,564 outlets</w:t>
             </w:r>
           </w:p>
         </w:tc>
@@ -2051,7 +2017,7 @@
               <w:rPr>
                 <w:sz w:val="16"/>
               </w:rPr>
-              <w:t>0.034  (p=2.29e-06)</w:t>
+              <w:t>0.054  (p=2.43e-14)</w:t>
             </w:r>
           </w:p>
         </w:tc>
@@ -2120,10 +2086,23 @@
       <w:r>
         <w:rPr>
           <w:b w:val="0"/>
+          <w:i w:val="0"/>
+          <w:sz w:val="18"/>
+        </w:rPr>
+        <w:t>We also ran a pseudo-out-of-sample check: re-fitted the peer-Q90 framework using only 2023+2024 history and predicted Jan 2025 for outlets whose Jan 2025 was itself unconstrained (n = 11,169). Spearman ρ between predicted Jan 2025 and observed Jan 2025 was 0.805 — strong directional agreement. The median prediction was 65% above observed, expected because the framework predicts uncapped potential rather than observed censored values.</w:t>
+      </w:r>
+    </w:p>
+    <w:p>
+      <w:pPr>
+        <w:spacing w:after="80"/>
+      </w:pPr>
+      <w:r>
+        <w:rPr>
+          <w:b w:val="0"/>
           <w:i/>
           <w:sz w:val="16"/>
         </w:rPr>
-        <w:t>References: Tobin 1958 (censored regression); Koenker &amp; Bassett 1978 (quantile regression); Buchinsky 1998 (recent quantile-regression developments); Greene 2008, Econometric Analysis, chap. 19.</w:t>
+        <w:t>References: Tobin 1958 (censored regression); Amemiya 1984 (Tobit family); Koenker &amp; Bassett 1978 (quantile regression); Buchinsky 1998 (quantile-regression developments); Greene 2008, Econometric Analysis, chap. 19.</w:t>
       </w:r>
     </w:p>
     <w:p>
@@ -2147,7 +2126,7 @@
           <w:i w:val="0"/>
           <w:sz w:val="18"/>
         </w:rPr>
-        <w:t>(1) Constraint-rule (ii) is partially circular: outlet activity is used to identify constraint, and the Q90 over the resulting unconstrained subset feeds back into the same outlet's potential. We mitigate by combining own-Q90 with peer-Q90 in a max operator. (2) OpenStreetMap rural coverage is uneven; within-province POI-tier normalisation reduces but does not eliminate the bias. (3) Spatial correlation between predicted potential and total POI density is weak (Spearman ρ = 0.034) because POI signal is already absorbed by the cohort grouping. (4) The Seasonality_Index for January 2026 is extrapolated from 2023-2025 Januaries via majority vote per distributor.</w:t>
+        <w:t>(1) Constraint-rule (ii) is partially circular: outlet activity is used to identify constraint, and the Q90 over the resulting unconstrained subset feeds back into the same outlet's potential. We mitigate by combining own-Q90 with peer-Q90 in a max operator. (2) OpenStreetMap rural coverage is uneven; within-province POI-tier normalisation reduces but does not eliminate the bias. (3) Spatial correlation between predicted potential and total POI density is weak (Spearman ρ = 0.05) because POI signal is already absorbed by the cohort grouping. (4) The Seasonality_Index for January 2026 is extrapolated from 2023-2025 Januaries via majority vote per distributor (all distributors had identical labels across years so this is robust).</w:t>
       </w:r>
     </w:p>
     <w:p>

</xml_diff>

<commit_message>
Enhance DataX report and modeling pipeline with new features and analyses
- Updated DataX report (DOCX and PDF) to reflect changes in data forensics, feature engineering, and model validation results.
- Added competitor density calculations to assess local beverage-retail competition within 500m, 1km, and 2km radii.
- Introduced climate data for Sri Lanka to improve predictions related to beverage consumption.
- Implemented Stochastic Frontier Analysis (SFA) for better estimation of uncapped potential.
- Enhanced business recommendations by identifying top outlets for cooler deployment based on predicted uplift.
- Added visualizations for predicted potential across Sri Lanka and by province.
- Improved hold-out validation process for January 2025 predictions.
</commit_message>
<xml_diff>
--- a/report/DataX_report.docx
+++ b/report/DataX_report.docx
@@ -254,7 +254,7 @@
               <w:rPr>
                 <w:sz w:val="18"/>
               </w:rPr>
-              <w:t>147 (incl. 76 POI-density + 7 SKU-mix)</w:t>
+              <w:t>155 (incl. 76 POI density + 7 SKU mix + competitor density + climate)</w:t>
             </w:r>
           </w:p>
         </w:tc>
@@ -299,7 +299,7 @@
                 <w:b/>
                 <w:sz w:val="18"/>
               </w:rPr>
-              <w:t>Method convergence (peer-Q90 / log-linear / Tobit)</w:t>
+              <w:t>Statistical methods cross-checked</w:t>
             </w:r>
           </w:p>
         </w:tc>
@@ -312,7 +312,36 @@
               <w:rPr>
                 <w:sz w:val="18"/>
               </w:rPr>
-              <w:t>ρ = 0.86 / 0.83 / 0.93</w:t>
+              <w:t>4 (peer-Q90, log-linear, Tobit MLE, SFA Aigner et al 1977)</w:t>
+            </w:r>
+          </w:p>
+        </w:tc>
+      </w:tr>
+      <w:tr>
+        <w:tc>
+          <w:tcPr>
+            <w:tcW w:type="dxa" w:w="2551"/>
+          </w:tcPr>
+          <w:p>
+            <w:r>
+              <w:rPr>
+                <w:b/>
+                <w:sz w:val="18"/>
+              </w:rPr>
+              <w:t>Method convergence (pairwise Spearman ρ)</w:t>
+            </w:r>
+          </w:p>
+        </w:tc>
+        <w:tc>
+          <w:tcPr>
+            <w:tcW w:type="dxa" w:w="6803"/>
+          </w:tcPr>
+          <w:p>
+            <w:r>
+              <w:rPr>
+                <w:sz w:val="18"/>
+              </w:rPr>
+              <w:t>0.86 / 0.83 / 0.84 / 0.93</w:t>
             </w:r>
           </w:p>
         </w:tc>
@@ -341,7 +370,7 @@
               <w:rPr>
                 <w:sz w:val="18"/>
               </w:rPr>
-              <w:t>0.50 peer-Q90 + 0.25 log-linear + 0.25 Tobit</w:t>
+              <w:t>0.40 peer-Q90 + 0.20 log-linear + 0.20 Tobit + 0.20 SFA</w:t>
             </w:r>
           </w:p>
         </w:tc>
@@ -386,6 +415,35 @@
                 <w:b/>
                 <w:sz w:val="18"/>
               </w:rPr>
+              <w:t>Top-100 outlets uplift opportunity</w:t>
+            </w:r>
+          </w:p>
+        </w:tc>
+        <w:tc>
+          <w:tcPr>
+            <w:tcW w:type="dxa" w:w="6803"/>
+          </w:tcPr>
+          <w:p>
+            <w:r>
+              <w:rPr>
+                <w:sz w:val="18"/>
+              </w:rPr>
+              <w:t>100,374 L / month</w:t>
+            </w:r>
+          </w:p>
+        </w:tc>
+      </w:tr>
+      <w:tr>
+        <w:tc>
+          <w:tcPr>
+            <w:tcW w:type="dxa" w:w="2551"/>
+          </w:tcPr>
+          <w:p>
+            <w:r>
+              <w:rPr>
+                <w:b/>
+                <w:sz w:val="18"/>
+              </w:rPr>
               <w:t>Predicted potential (median / mean)</w:t>
             </w:r>
           </w:p>
@@ -399,7 +457,7 @@
               <w:rPr>
                 <w:sz w:val="18"/>
               </w:rPr>
-              <w:t>171.1 L / 293.8 L</w:t>
+              <w:t>170.7 L / 300.3 L</w:t>
             </w:r>
           </w:p>
         </w:tc>
@@ -1843,20 +1901,7 @@
           <w:i w:val="0"/>
           <w:sz w:val="18"/>
         </w:rPr>
-        <w:t>Step D - First cross-check: log-linear regression on the unconstrained subset. OLS on log(1 + monthly_volume) using outlet attributes, SKU-mix features (avg price, premium / mid / mass share), POI density, Cooler_Count, coordinates. A complete-case censored regression proxy following Tobin 1958 and Greene 2008.</w:t>
-      </w:r>
-    </w:p>
-    <w:p>
-      <w:pPr>
-        <w:spacing w:after="80"/>
-      </w:pPr>
-      <w:r>
-        <w:rPr>
-          <w:b w:val="0"/>
-          <w:i w:val="0"/>
-          <w:sz w:val="18"/>
-        </w:rPr>
-        <w:t>Step E - Second cross-check: full Tobit Type I maximum likelihood with right-censoring at the observed value for constrained months. Fitted via L-BFGS-B on the joint log-likelihood combining log-normal pdf for uncensored observations and log survival function for censored. When all three Spearman ρ pairs exceed 0.75, we blend the methods with weights 0.50 peer-Q90 + 0.25 log-linear + 0.25 Tobit. Observed convergence on this submission: ρ(peer, log-linear) = 0.86, ρ(peer, Tobit) = 0.83, ρ(log-linear, Tobit) = 0.93 — all above threshold.</w:t>
+        <w:t>Step D/E/F - Three independent cross-checks. (D) Log-linear regression on the unconstrained subset (Tobin 1958 / Greene 2008 complete-case proxy) using outlet attributes + SKU-mix + POI density + coordinates: ρ(peer)=0.86. (E) Tobit Type I MLE with right-censoring at observed value when constrained: ρ(peer)=0.83. (F) Stochastic Frontier Analysis (Aigner et al 1977) half-normal model `log V = X β + v - u` where v is symmetric noise and u is one-sided inefficiency; the frontier exp(X β) is potential: ρ(peer)=0.84. All four pairwise Spearman exceed 0.75 → 4-way ensemble 0.40 peer-Q90 + 0.20 log-linear + 0.20 Tobit + 0.20 SFA (peer-Q90 anchor weight as the only non-parametric method).</w:t>
       </w:r>
     </w:p>
     <w:p>
@@ -2017,7 +2062,7 @@
               <w:rPr>
                 <w:sz w:val="16"/>
               </w:rPr>
-              <w:t>0.054  (p=2.43e-14)</w:t>
+              <w:t>0.059  (p=1.47e-16)</w:t>
             </w:r>
           </w:p>
         </w:tc>
@@ -2103,6 +2148,30 @@
           <w:sz w:val="16"/>
         </w:rPr>
         <w:t>References: Tobin 1958 (censored regression); Amemiya 1984 (Tobit family); Koenker &amp; Bassett 1978 (quantile regression); Buchinsky 1998 (quantile-regression developments); Greene 2008, Econometric Analysis, chap. 19.</w:t>
+      </w:r>
+    </w:p>
+    <w:p>
+      <w:pPr>
+        <w:pStyle w:val="Heading2"/>
+      </w:pPr>
+      <w:r>
+        <w:rPr>
+          <w:color w:val="1A3A6B"/>
+        </w:rPr>
+        <w:t>Business Recommendations</w:t>
+      </w:r>
+    </w:p>
+    <w:p>
+      <w:pPr>
+        <w:spacing w:after="80"/>
+      </w:pPr>
+      <w:r>
+        <w:rPr>
+          <w:b w:val="0"/>
+          <w:i w:val="0"/>
+          <w:sz w:val="18"/>
+        </w:rPr>
+        <w:t>Outlets are ranked by predicted-vs-observed uplift (with extra weight when Cooler_Count = 0). The Top-100 list (outputs/audit/top100_outlets_priority.csv) represents ~100,374 L / month of currently-uncapped demand — concentrated in outlets without cold-storage. This is the natural cooler-deployment and trade-marketing target. A Sri Lanka outlet potential map and per-province bars are saved as audit PNGs.</w:t>
       </w:r>
     </w:p>
     <w:p>

</xml_diff>

<commit_message>
Update DataX report to correct demand estimates for top outlets
</commit_message>
<xml_diff>
--- a/report/DataX_report.docx
+++ b/report/DataX_report.docx
@@ -6,6 +6,7 @@
       <w:pPr>
         <w:jc w:val="center"/>
       </w:pPr>
+      <w:proofErr w:type="spellStart"/>
       <w:r>
         <w:rPr>
           <w:b/>
@@ -13,7 +14,17 @@
           <w:sz w:val="36"/>
           <w:szCs w:val="36"/>
         </w:rPr>
-        <w:t>DataStorm 7.0 - Storming Round</w:t>
+        <w:t>DataStorm</w:t>
+      </w:r>
+      <w:proofErr w:type="spellEnd"/>
+      <w:r>
+        <w:rPr>
+          <w:b/>
+          <w:bCs/>
+          <w:sz w:val="36"/>
+          <w:szCs w:val="36"/>
+        </w:rPr>
+        <w:t xml:space="preserve"> 7.0 - Storming Round</w:t>
       </w:r>
     </w:p>
     <w:p>
@@ -47,8 +58,19 @@
           <w:sz w:val="28"/>
           <w:szCs w:val="28"/>
         </w:rPr>
-        <w:t>Team: DataX</w:t>
-      </w:r>
+        <w:t xml:space="preserve">Team: </w:t>
+      </w:r>
+      <w:proofErr w:type="spellStart"/>
+      <w:r>
+        <w:rPr>
+          <w:b/>
+          <w:bCs/>
+          <w:sz w:val="28"/>
+          <w:szCs w:val="28"/>
+        </w:rPr>
+        <w:t>DataX</w:t>
+      </w:r>
+      <w:proofErr w:type="spellEnd"/>
     </w:p>
     <w:p>
       <w:pPr>
@@ -69,7 +91,15 @@
         <w:spacing w:after="80"/>
       </w:pPr>
       <w:r>
-        <w:t>The competition target - "Maximum Monthly Purchase Potential" - has no observed ground truth. Historical volume V is censored: V = min(D, C), where D is true demand and C is systemic constraint (credit, stockouts, delivery caps). We therefore build a defensible statistical framework.</w:t>
+        <w:t xml:space="preserve">The competition target - "Maximum Monthly Purchase Potential" - has no observed ground truth. Historical volume V is censored: V = </w:t>
+      </w:r>
+      <w:proofErr w:type="gramStart"/>
+      <w:r>
+        <w:t>min(</w:t>
+      </w:r>
+      <w:proofErr w:type="gramEnd"/>
+      <w:r>
+        <w:t>D, C), where D is true demand and C is systemic constraint (credit, stockouts, delivery caps). We therefore build a defensible statistical framework.</w:t>
       </w:r>
     </w:p>
     <w:p>
@@ -101,7 +131,15 @@
         <w:spacing w:after="80"/>
       </w:pPr>
       <w:r>
-        <w:t xml:space="preserve">The 90th-percentile monthly volume of its peer cohort (Outlet_Type × Size × Province × POI-density-tier, with hierarchical fallback when a cohort is sparse). </w:t>
+        <w:t>The 90th-percentile monthly volume of its peer cohort (</w:t>
+      </w:r>
+      <w:proofErr w:type="spellStart"/>
+      <w:r>
+        <w:t>Outlet_Type</w:t>
+      </w:r>
+      <w:proofErr w:type="spellEnd"/>
+      <w:r>
+        <w:t xml:space="preserve"> × Size × Province × POI-density-tier, with hierarchical fallback when a cohort is sparse). </w:t>
       </w:r>
     </w:p>
     <w:p>
@@ -109,16 +147,18 @@
         <w:spacing w:after="80"/>
       </w:pPr>
       <w:r>
-        <w:t>We apply distributor-specific seasonality multipliers (calibrated empirically from the categorical Seasonality_Index), a year-over-year growth factor, and a holiday-count adjustment for January 2026. A log-</w:t>
-      </w:r>
-      <w:r>
-        <w:t xml:space="preserve">four methods (peer-Q90, log-linear, Tobit MLE, SFA) cross-check each other (pairwise </w:t>
-      </w:r>
-      <w:r>
-        <w:t>Spearman?</w:t>
-      </w:r>
-      <w:r>
-        <w:t xml:space="preserve"> = 0.83–0.93); a 4-way ensemble (0.40/0.20/0.20/0.20) produces the final number</w:t>
+        <w:t xml:space="preserve">We apply distributor-specific seasonality multipliers (calibrated empirically from the categorical </w:t>
+      </w:r>
+      <w:proofErr w:type="spellStart"/>
+      <w:r>
+        <w:t>Seasonality_Index</w:t>
+      </w:r>
+      <w:proofErr w:type="spellEnd"/>
+      <w:r>
+        <w:t>), a year-over-year growth factor, and a holiday-count adjustment for January 2026. A log-</w:t>
+      </w:r>
+      <w:r>
+        <w:t>four methods (peer-Q90, log-linear, Tobit MLE, SFA) cross-check each other (pairwise Spearman? = 0.83–0.93); a 4-way ensemble (0.40/0.20/0.20/0.20) produces the final number</w:t>
       </w:r>
       <w:r>
         <w:t>.</w:t>
@@ -395,7 +435,15 @@
               <w:t xml:space="preserve"> 6</w:t>
             </w:r>
             <w:r>
-              <w:t xml:space="preserve"> competitor  + </w:t>
+              <w:t xml:space="preserve"> </w:t>
+            </w:r>
+            <w:proofErr w:type="gramStart"/>
+            <w:r>
+              <w:t>competitor  +</w:t>
+            </w:r>
+            <w:proofErr w:type="gramEnd"/>
+            <w:r>
+              <w:t xml:space="preserve"> </w:t>
             </w:r>
             <w:r>
               <w:t xml:space="preserve">2 </w:t>
@@ -511,7 +559,15 @@
           </w:tcPr>
           <w:p>
             <w:r>
-              <w:t>0.40 peer-Q90 + 0.20 log-linear + 0.20 Tobit + 0.20 SFA</w:t>
+              <w:t xml:space="preserve">0.40 </w:t>
+            </w:r>
+            <w:proofErr w:type="gramStart"/>
+            <w:r>
+              <w:t>peer</w:t>
+            </w:r>
+            <w:proofErr w:type="gramEnd"/>
+            <w:r>
+              <w:t>-Q90 + 0.20 log-linear + 0.20 Tobit + 0.20 SFA</w:t>
             </w:r>
           </w:p>
         </w:tc>
@@ -548,12 +604,21 @@
             <w:tcW w:w="4170" w:type="dxa"/>
           </w:tcPr>
           <w:p>
+            <w:proofErr w:type="gramStart"/>
             <w:r>
               <w:rPr>
                 <w:b/>
                 <w:bCs/>
               </w:rPr>
-              <w:t>Top-100 outlets uplift opportunity</w:t>
+              <w:t>Top-100</w:t>
+            </w:r>
+            <w:proofErr w:type="gramEnd"/>
+            <w:r>
+              <w:rPr>
+                <w:b/>
+                <w:bCs/>
+              </w:rPr>
+              <w:t xml:space="preserve"> outlets uplift opportunity</w:t>
             </w:r>
           </w:p>
         </w:tc>
@@ -645,7 +710,31 @@
         <w:spacing w:after="80"/>
       </w:pPr>
       <w:r>
-        <w:t>All five raw files are ingested into the Bronze layer with sha256 manifests, then subjected to five reusable parameterised data-quality checks plus a forensics layer that targets legacy SFA / distributor-ERP artifacts. Records failing any check are quarantined with a documented `_rejection_reason` - none are silently dropped.</w:t>
+        <w:t xml:space="preserve">All five raw files are ingested into the </w:t>
+      </w:r>
+      <w:proofErr w:type="gramStart"/>
+      <w:r>
+        <w:t>Bronze</w:t>
+      </w:r>
+      <w:proofErr w:type="gramEnd"/>
+      <w:r>
+        <w:t xml:space="preserve"> layer with sha256 manifests, then subjected to five reusable </w:t>
+      </w:r>
+      <w:proofErr w:type="spellStart"/>
+      <w:r>
+        <w:t>parameterised</w:t>
+      </w:r>
+      <w:proofErr w:type="spellEnd"/>
+      <w:r>
+        <w:t xml:space="preserve"> data-quality checks plus a forensics layer that targets legacy SFA / distributor-ERP artifacts. Records failing any check are quarantined with a documented `_</w:t>
+      </w:r>
+      <w:proofErr w:type="spellStart"/>
+      <w:r>
+        <w:t>rejection_reason</w:t>
+      </w:r>
+      <w:proofErr w:type="spellEnd"/>
+      <w:r>
+        <w:t>` - none are silently dropped.</w:t>
       </w:r>
     </w:p>
     <w:p>
@@ -659,19 +748,377 @@
         <w:rPr>
           <w:color w:val="000000"/>
         </w:rPr>
-        <w:t>DQ Architecture (reusable &amp; parameterised)</w:t>
+        <w:t xml:space="preserve">DQ Architecture (reusable &amp; </w:t>
+      </w:r>
+      <w:proofErr w:type="spellStart"/>
+      <w:r>
+        <w:rPr>
+          <w:color w:val="000000"/>
+        </w:rPr>
+        <w:t>parameterised</w:t>
+      </w:r>
+      <w:proofErr w:type="spellEnd"/>
+      <w:r>
+        <w:rPr>
+          <w:color w:val="000000"/>
+        </w:rPr>
+        <w:t>)</w:t>
       </w:r>
     </w:p>
     <w:p>
       <w:pPr>
         <w:spacing w:after="80"/>
       </w:pPr>
+      <w:proofErr w:type="spellStart"/>
       <w:r>
         <w:rPr>
           <w:sz w:val="18"/>
           <w:szCs w:val="18"/>
         </w:rPr>
-        <w:t>check_duplicates(df, primary_keys), check_nulls(df, mandatory_columns), check_referential_integrity(df, fk_column, valid_values), check_value_range(df, column, min_val, max_val), check_format(df, column, validator). Wrapped by apply_check() which persists rejects to data/silver/quarantine/{dataset}_rejected.parquet and appends a row to _quarantine_summary.csv.</w:t>
+        <w:t>check_</w:t>
+      </w:r>
+      <w:proofErr w:type="gramStart"/>
+      <w:r>
+        <w:rPr>
+          <w:sz w:val="18"/>
+          <w:szCs w:val="18"/>
+        </w:rPr>
+        <w:t>duplicates</w:t>
+      </w:r>
+      <w:proofErr w:type="spellEnd"/>
+      <w:r>
+        <w:rPr>
+          <w:sz w:val="18"/>
+          <w:szCs w:val="18"/>
+        </w:rPr>
+        <w:t>(</w:t>
+      </w:r>
+      <w:proofErr w:type="spellStart"/>
+      <w:proofErr w:type="gramEnd"/>
+      <w:r>
+        <w:rPr>
+          <w:sz w:val="18"/>
+          <w:szCs w:val="18"/>
+        </w:rPr>
+        <w:t>df</w:t>
+      </w:r>
+      <w:proofErr w:type="spellEnd"/>
+      <w:r>
+        <w:rPr>
+          <w:sz w:val="18"/>
+          <w:szCs w:val="18"/>
+        </w:rPr>
+        <w:t xml:space="preserve">, </w:t>
+      </w:r>
+      <w:proofErr w:type="spellStart"/>
+      <w:r>
+        <w:rPr>
+          <w:sz w:val="18"/>
+          <w:szCs w:val="18"/>
+        </w:rPr>
+        <w:t>primary_keys</w:t>
+      </w:r>
+      <w:proofErr w:type="spellEnd"/>
+      <w:r>
+        <w:rPr>
+          <w:sz w:val="18"/>
+          <w:szCs w:val="18"/>
+        </w:rPr>
+        <w:t xml:space="preserve">), </w:t>
+      </w:r>
+      <w:proofErr w:type="spellStart"/>
+      <w:r>
+        <w:rPr>
+          <w:sz w:val="18"/>
+          <w:szCs w:val="18"/>
+        </w:rPr>
+        <w:t>check_</w:t>
+      </w:r>
+      <w:proofErr w:type="gramStart"/>
+      <w:r>
+        <w:rPr>
+          <w:sz w:val="18"/>
+          <w:szCs w:val="18"/>
+        </w:rPr>
+        <w:t>nulls</w:t>
+      </w:r>
+      <w:proofErr w:type="spellEnd"/>
+      <w:r>
+        <w:rPr>
+          <w:sz w:val="18"/>
+          <w:szCs w:val="18"/>
+        </w:rPr>
+        <w:t>(</w:t>
+      </w:r>
+      <w:proofErr w:type="spellStart"/>
+      <w:proofErr w:type="gramEnd"/>
+      <w:r>
+        <w:rPr>
+          <w:sz w:val="18"/>
+          <w:szCs w:val="18"/>
+        </w:rPr>
+        <w:t>df</w:t>
+      </w:r>
+      <w:proofErr w:type="spellEnd"/>
+      <w:r>
+        <w:rPr>
+          <w:sz w:val="18"/>
+          <w:szCs w:val="18"/>
+        </w:rPr>
+        <w:t xml:space="preserve">, </w:t>
+      </w:r>
+      <w:proofErr w:type="spellStart"/>
+      <w:r>
+        <w:rPr>
+          <w:sz w:val="18"/>
+          <w:szCs w:val="18"/>
+        </w:rPr>
+        <w:t>mandatory_columns</w:t>
+      </w:r>
+      <w:proofErr w:type="spellEnd"/>
+      <w:r>
+        <w:rPr>
+          <w:sz w:val="18"/>
+          <w:szCs w:val="18"/>
+        </w:rPr>
+        <w:t xml:space="preserve">), </w:t>
+      </w:r>
+      <w:proofErr w:type="spellStart"/>
+      <w:r>
+        <w:rPr>
+          <w:sz w:val="18"/>
+          <w:szCs w:val="18"/>
+        </w:rPr>
+        <w:t>check_referential_</w:t>
+      </w:r>
+      <w:proofErr w:type="gramStart"/>
+      <w:r>
+        <w:rPr>
+          <w:sz w:val="18"/>
+          <w:szCs w:val="18"/>
+        </w:rPr>
+        <w:t>integrity</w:t>
+      </w:r>
+      <w:proofErr w:type="spellEnd"/>
+      <w:r>
+        <w:rPr>
+          <w:sz w:val="18"/>
+          <w:szCs w:val="18"/>
+        </w:rPr>
+        <w:t>(</w:t>
+      </w:r>
+      <w:proofErr w:type="spellStart"/>
+      <w:proofErr w:type="gramEnd"/>
+      <w:r>
+        <w:rPr>
+          <w:sz w:val="18"/>
+          <w:szCs w:val="18"/>
+        </w:rPr>
+        <w:t>df</w:t>
+      </w:r>
+      <w:proofErr w:type="spellEnd"/>
+      <w:r>
+        <w:rPr>
+          <w:sz w:val="18"/>
+          <w:szCs w:val="18"/>
+        </w:rPr>
+        <w:t xml:space="preserve">, </w:t>
+      </w:r>
+      <w:proofErr w:type="spellStart"/>
+      <w:r>
+        <w:rPr>
+          <w:sz w:val="18"/>
+          <w:szCs w:val="18"/>
+        </w:rPr>
+        <w:t>fk_column</w:t>
+      </w:r>
+      <w:proofErr w:type="spellEnd"/>
+      <w:r>
+        <w:rPr>
+          <w:sz w:val="18"/>
+          <w:szCs w:val="18"/>
+        </w:rPr>
+        <w:t xml:space="preserve">, </w:t>
+      </w:r>
+      <w:proofErr w:type="spellStart"/>
+      <w:r>
+        <w:rPr>
+          <w:sz w:val="18"/>
+          <w:szCs w:val="18"/>
+        </w:rPr>
+        <w:t>valid_values</w:t>
+      </w:r>
+      <w:proofErr w:type="spellEnd"/>
+      <w:r>
+        <w:rPr>
+          <w:sz w:val="18"/>
+          <w:szCs w:val="18"/>
+        </w:rPr>
+        <w:t xml:space="preserve">), </w:t>
+      </w:r>
+      <w:proofErr w:type="spellStart"/>
+      <w:r>
+        <w:rPr>
+          <w:sz w:val="18"/>
+          <w:szCs w:val="18"/>
+        </w:rPr>
+        <w:t>check_value_</w:t>
+      </w:r>
+      <w:proofErr w:type="gramStart"/>
+      <w:r>
+        <w:rPr>
+          <w:sz w:val="18"/>
+          <w:szCs w:val="18"/>
+        </w:rPr>
+        <w:t>range</w:t>
+      </w:r>
+      <w:proofErr w:type="spellEnd"/>
+      <w:r>
+        <w:rPr>
+          <w:sz w:val="18"/>
+          <w:szCs w:val="18"/>
+        </w:rPr>
+        <w:t>(</w:t>
+      </w:r>
+      <w:proofErr w:type="spellStart"/>
+      <w:proofErr w:type="gramEnd"/>
+      <w:r>
+        <w:rPr>
+          <w:sz w:val="18"/>
+          <w:szCs w:val="18"/>
+        </w:rPr>
+        <w:t>df</w:t>
+      </w:r>
+      <w:proofErr w:type="spellEnd"/>
+      <w:r>
+        <w:rPr>
+          <w:sz w:val="18"/>
+          <w:szCs w:val="18"/>
+        </w:rPr>
+        <w:t xml:space="preserve">, column, </w:t>
+      </w:r>
+      <w:proofErr w:type="spellStart"/>
+      <w:r>
+        <w:rPr>
+          <w:sz w:val="18"/>
+          <w:szCs w:val="18"/>
+        </w:rPr>
+        <w:t>min_val</w:t>
+      </w:r>
+      <w:proofErr w:type="spellEnd"/>
+      <w:r>
+        <w:rPr>
+          <w:sz w:val="18"/>
+          <w:szCs w:val="18"/>
+        </w:rPr>
+        <w:t xml:space="preserve">, </w:t>
+      </w:r>
+      <w:proofErr w:type="spellStart"/>
+      <w:r>
+        <w:rPr>
+          <w:sz w:val="18"/>
+          <w:szCs w:val="18"/>
+        </w:rPr>
+        <w:t>max_val</w:t>
+      </w:r>
+      <w:proofErr w:type="spellEnd"/>
+      <w:r>
+        <w:rPr>
+          <w:sz w:val="18"/>
+          <w:szCs w:val="18"/>
+        </w:rPr>
+        <w:t xml:space="preserve">), </w:t>
+      </w:r>
+      <w:proofErr w:type="spellStart"/>
+      <w:r>
+        <w:rPr>
+          <w:sz w:val="18"/>
+          <w:szCs w:val="18"/>
+        </w:rPr>
+        <w:t>check_</w:t>
+      </w:r>
+      <w:proofErr w:type="gramStart"/>
+      <w:r>
+        <w:rPr>
+          <w:sz w:val="18"/>
+          <w:szCs w:val="18"/>
+        </w:rPr>
+        <w:t>format</w:t>
+      </w:r>
+      <w:proofErr w:type="spellEnd"/>
+      <w:r>
+        <w:rPr>
+          <w:sz w:val="18"/>
+          <w:szCs w:val="18"/>
+        </w:rPr>
+        <w:t>(</w:t>
+      </w:r>
+      <w:proofErr w:type="spellStart"/>
+      <w:proofErr w:type="gramEnd"/>
+      <w:r>
+        <w:rPr>
+          <w:sz w:val="18"/>
+          <w:szCs w:val="18"/>
+        </w:rPr>
+        <w:t>df</w:t>
+      </w:r>
+      <w:proofErr w:type="spellEnd"/>
+      <w:r>
+        <w:rPr>
+          <w:sz w:val="18"/>
+          <w:szCs w:val="18"/>
+        </w:rPr>
+        <w:t xml:space="preserve">, column, validator). Wrapped by </w:t>
+      </w:r>
+      <w:proofErr w:type="spellStart"/>
+      <w:r>
+        <w:rPr>
+          <w:sz w:val="18"/>
+          <w:szCs w:val="18"/>
+        </w:rPr>
+        <w:t>apply_</w:t>
+      </w:r>
+      <w:proofErr w:type="gramStart"/>
+      <w:r>
+        <w:rPr>
+          <w:sz w:val="18"/>
+          <w:szCs w:val="18"/>
+        </w:rPr>
+        <w:t>check</w:t>
+      </w:r>
+      <w:proofErr w:type="spellEnd"/>
+      <w:r>
+        <w:rPr>
+          <w:sz w:val="18"/>
+          <w:szCs w:val="18"/>
+        </w:rPr>
+        <w:t>(</w:t>
+      </w:r>
+      <w:proofErr w:type="gramEnd"/>
+      <w:r>
+        <w:rPr>
+          <w:sz w:val="18"/>
+          <w:szCs w:val="18"/>
+        </w:rPr>
+        <w:t>) which persists rejects to data/silver/quarantine/{dataset}_</w:t>
+      </w:r>
+      <w:proofErr w:type="spellStart"/>
+      <w:proofErr w:type="gramStart"/>
+      <w:r>
+        <w:rPr>
+          <w:sz w:val="18"/>
+          <w:szCs w:val="18"/>
+        </w:rPr>
+        <w:t>rejected.parquet</w:t>
+      </w:r>
+      <w:proofErr w:type="spellEnd"/>
+      <w:proofErr w:type="gramEnd"/>
+      <w:r>
+        <w:rPr>
+          <w:sz w:val="18"/>
+          <w:szCs w:val="18"/>
+        </w:rPr>
+        <w:t xml:space="preserve"> and appends a row to _quarantine_summary.csv.</w:t>
       </w:r>
     </w:p>
     <w:p>
@@ -822,9 +1269,11 @@
             <w:tcW w:w="2040" w:type="dxa"/>
           </w:tcPr>
           <w:p>
+            <w:proofErr w:type="spellStart"/>
             <w:r>
               <w:t>outlet_coordinates</w:t>
             </w:r>
+            <w:proofErr w:type="spellEnd"/>
           </w:p>
         </w:tc>
         <w:tc>
@@ -874,9 +1323,11 @@
             <w:tcW w:w="2040" w:type="dxa"/>
           </w:tcPr>
           <w:p>
+            <w:proofErr w:type="spellStart"/>
             <w:r>
               <w:t>outlet_master</w:t>
             </w:r>
+            <w:proofErr w:type="spellEnd"/>
           </w:p>
         </w:tc>
         <w:tc>
@@ -1120,9 +1571,11 @@
             <w:tcW w:w="3030" w:type="dxa"/>
           </w:tcPr>
           <w:p>
+            <w:proofErr w:type="spellStart"/>
             <w:r>
               <w:t>flagged_for_modeling</w:t>
             </w:r>
+            <w:proofErr w:type="spellEnd"/>
           </w:p>
         </w:tc>
       </w:tr>
@@ -1173,7 +1626,15 @@
         <w:spacing w:after="80"/>
       </w:pPr>
       <w:r>
-        <w:t xml:space="preserve">Highlights: 61,909 duplicate transactions on (Outlet_ID, Year, Month, SKU_ID); 240 outlets with coordinates outside the Sri Lanka bounding box; </w:t>
+        <w:t>Highlights: 61,909 duplicate transactions on (</w:t>
+      </w:r>
+      <w:proofErr w:type="spellStart"/>
+      <w:r>
+        <w:t>Outlet_ID</w:t>
+      </w:r>
+      <w:proofErr w:type="spellEnd"/>
+      <w:r>
+        <w:t xml:space="preserve">, Year, Month, SKU_ID); 240 outlets with coordinates outside the Sri Lanka bounding box; </w:t>
       </w:r>
       <w:r>
         <w:t>979</w:t>
@@ -1181,8 +1642,21 @@
       <w:r>
         <w:t xml:space="preserve"> </w:t>
       </w:r>
-      <w:r>
-        <w:t>Outlet_Type entries normalised from typos such as 'Grocry' → 'Grocery'</w:t>
+      <w:proofErr w:type="spellStart"/>
+      <w:r>
+        <w:t>Outlet_Type</w:t>
+      </w:r>
+      <w:proofErr w:type="spellEnd"/>
+      <w:r>
+        <w:t xml:space="preserve"> entries </w:t>
+      </w:r>
+      <w:proofErr w:type="spellStart"/>
+      <w:r>
+        <w:t>normalised</w:t>
+      </w:r>
+      <w:proofErr w:type="spellEnd"/>
+      <w:r>
+        <w:t xml:space="preserve"> from typos such as 'Grocry' → 'Grocery'</w:t>
       </w:r>
       <w:r>
         <w:t xml:space="preserve"> </w:t>
@@ -1197,7 +1671,23 @@
         <w:t xml:space="preserve"> 'Bakry' → 'Bakery'</w:t>
       </w:r>
       <w:r>
-        <w:t>; 4,611 return transactions identified via a 3-way classification of (Volume_Liters, Total_Bill_Value) sign pairs (kept and net-subtracted, not silently dropped).</w:t>
+        <w:t>; 4,611 return transactions identified via a 3-way classification of (</w:t>
+      </w:r>
+      <w:proofErr w:type="spellStart"/>
+      <w:r>
+        <w:t>Volume_Liters</w:t>
+      </w:r>
+      <w:proofErr w:type="spellEnd"/>
+      <w:r>
+        <w:t xml:space="preserve">, </w:t>
+      </w:r>
+      <w:proofErr w:type="spellStart"/>
+      <w:r>
+        <w:t>Total_Bill_Value</w:t>
+      </w:r>
+      <w:proofErr w:type="spellEnd"/>
+      <w:r>
+        <w:t>) sign pairs (kept and net-subtracted, not silently dropped).</w:t>
       </w:r>
     </w:p>
     <w:p>
@@ -1209,7 +1699,15 @@
         </w:rPr>
       </w:pPr>
       <w:r>
-        <w:t>The supplied codebook references a Product_Name column absent from the transactions file and names the seasonality file as distributor_seasonality.csv while the actual file is distributor_seasonality_details.csv - both logged as governance findings.</w:t>
+        <w:t xml:space="preserve">The supplied codebook references a </w:t>
+      </w:r>
+      <w:proofErr w:type="spellStart"/>
+      <w:r>
+        <w:t>Product_Name</w:t>
+      </w:r>
+      <w:proofErr w:type="spellEnd"/>
+      <w:r>
+        <w:t xml:space="preserve"> column absent from the transactions file and names the seasonality file as distributor_seasonality.csv while the actual file is distributor_seasonality_details.csv - both logged as governance findings.</w:t>
       </w:r>
     </w:p>
     <w:p>
@@ -1248,7 +1746,15 @@
         <w:spacing w:after="0"/>
       </w:pPr>
       <w:r>
-        <w:t>A naive per-outlet loop (20,000 outlets × ≥1 sec rate-limited request) would take ≥ 5.5 hours; we instead issue one bbox-query per POI tag covering all of Sri Lanka (5.9°-9.9° N, 79.5°-82.0° E), yielding 16 queries total.</w:t>
+        <w:t xml:space="preserve">A naive per-outlet loop (20,000 outlets × ≥1 sec rate-limited request) would take ≥ 5.5 hours; we instead issue one </w:t>
+      </w:r>
+      <w:proofErr w:type="spellStart"/>
+      <w:r>
+        <w:t>bbox</w:t>
+      </w:r>
+      <w:proofErr w:type="spellEnd"/>
+      <w:r>
+        <w:t>-query per POI tag covering all of Sri Lanka (5.9°-9.9° N, 79.5°-82.0° E), yielding 16 queries total.</w:t>
       </w:r>
     </w:p>
     <w:p>
@@ -1260,7 +1766,15 @@
         <w:spacing w:after="80"/>
       </w:pPr>
       <w:r>
-        <w:t>Raw JSON responses are cached to data/bronze/poi_raw/ so re-runs are free, and an exponential-backoff retry loop handles HTTP 429/504 rate-limit responses.</w:t>
+        <w:t>Raw JSON responses are cached to data/bronze/</w:t>
+      </w:r>
+      <w:proofErr w:type="spellStart"/>
+      <w:r>
+        <w:t>poi_raw</w:t>
+      </w:r>
+      <w:proofErr w:type="spellEnd"/>
+      <w:r>
+        <w:t>/ so re-runs are free, and an exponential-backoff retry loop handles HTTP 429/504 rate-limit responses.</w:t>
       </w:r>
     </w:p>
     <w:p>
@@ -1299,7 +1813,15 @@
         <w:spacing w:after="0"/>
       </w:pPr>
       <w:r>
-        <w:t>highway=bus_stop. Retail proxy: shop=supermarket, convenience, alcohol;</w:t>
+        <w:t>highway=</w:t>
+      </w:r>
+      <w:proofErr w:type="spellStart"/>
+      <w:r>
+        <w:t>bus_stop</w:t>
+      </w:r>
+      <w:proofErr w:type="spellEnd"/>
+      <w:r>
+        <w:t>. Retail proxy: shop=supermarket, convenience, alcohol;</w:t>
       </w:r>
     </w:p>
     <w:p>
@@ -1323,7 +1845,15 @@
         <w:spacing w:after="0"/>
       </w:pPr>
       <w:r>
-        <w:t>tourism=hotel, attraction. Community/transit: amenity=place_of_worship, fuel;</w:t>
+        <w:t>tourism=hotel, attraction. Community/transit: amenity=</w:t>
+      </w:r>
+      <w:proofErr w:type="spellStart"/>
+      <w:r>
+        <w:t>place_of_worship</w:t>
+      </w:r>
+      <w:proofErr w:type="spellEnd"/>
+      <w:r>
+        <w:t>, fuel;</w:t>
       </w:r>
     </w:p>
     <w:p>
@@ -1351,7 +1881,21 @@
           <w:color w:val="000000"/>
         </w:rPr>
         <w:lastRenderedPageBreak/>
-        <w:t>Per-Outlet Mapping (spatial join)</w:t>
+        <w:t xml:space="preserve">Per-Outlet Mapping (spatial </w:t>
+      </w:r>
+      <w:proofErr w:type="gramStart"/>
+      <w:r>
+        <w:rPr>
+          <w:color w:val="000000"/>
+        </w:rPr>
+        <w:t>join</w:t>
+      </w:r>
+      <w:proofErr w:type="gramEnd"/>
+      <w:r>
+        <w:rPr>
+          <w:color w:val="000000"/>
+        </w:rPr>
+        <w:t>)</w:t>
       </w:r>
     </w:p>
     <w:p>
@@ -1363,7 +1907,23 @@
         <w:spacing w:after="0"/>
       </w:pPr>
       <w:r>
-        <w:t xml:space="preserve">All POI coordinates are loaded into a sklearn BallTree with haversine metric (radians). </w:t>
+        <w:t xml:space="preserve">All POI coordinates are loaded into a </w:t>
+      </w:r>
+      <w:proofErr w:type="spellStart"/>
+      <w:r>
+        <w:t>sklearn</w:t>
+      </w:r>
+      <w:proofErr w:type="spellEnd"/>
+      <w:r>
+        <w:t xml:space="preserve"> </w:t>
+      </w:r>
+      <w:proofErr w:type="spellStart"/>
+      <w:r>
+        <w:t>BallTree</w:t>
+      </w:r>
+      <w:proofErr w:type="spellEnd"/>
+      <w:r>
+        <w:t xml:space="preserve"> with haversine metric (radians). </w:t>
       </w:r>
     </w:p>
     <w:p>
@@ -1375,7 +1935,15 @@
         <w:spacing w:after="0"/>
       </w:pPr>
       <w:r>
-        <w:t xml:space="preserve">For each outlet we query count_only=True at three rings - 1 km, 2 km, 5 km - producing 16 tags × 3 radii = 48 POI-density features per outlet. </w:t>
+        <w:t xml:space="preserve">For each outlet we query </w:t>
+      </w:r>
+      <w:proofErr w:type="spellStart"/>
+      <w:r>
+        <w:t>count_only</w:t>
+      </w:r>
+      <w:proofErr w:type="spellEnd"/>
+      <w:r>
+        <w:t xml:space="preserve">=True at three rings - 1 km, 2 km, 5 km - producing 16 tags × 3 radii = 48 POI-density features per outlet. </w:t>
       </w:r>
     </w:p>
     <w:p>
@@ -1387,7 +1955,15 @@
         <w:spacing w:after="80"/>
       </w:pPr>
       <w:r>
-        <w:t>Aggregate poi_total_{r}km columns supply cohort-tier signal for the modelling step.</w:t>
+        <w:t xml:space="preserve">Aggregate </w:t>
+      </w:r>
+      <w:proofErr w:type="spellStart"/>
+      <w:r>
+        <w:t>poi_total</w:t>
+      </w:r>
+      <w:proofErr w:type="spellEnd"/>
+      <w:r>
+        <w:t>_{r}km columns supply cohort-tier signal for the modelling step.</w:t>
       </w:r>
     </w:p>
     <w:p>
@@ -1441,9 +2017,11 @@
             <w:tcW w:w="5100" w:type="dxa"/>
           </w:tcPr>
           <w:p>
+            <w:proofErr w:type="spellStart"/>
             <w:r>
               <w:t>POI_count_in_SL</w:t>
             </w:r>
+            <w:proofErr w:type="spellEnd"/>
           </w:p>
         </w:tc>
       </w:tr>
@@ -1454,8 +2032,13 @@
           </w:tcPr>
           <w:p>
             <w:r>
-              <w:t>amenity=place_of_worship</w:t>
-            </w:r>
+              <w:t>amenity=</w:t>
+            </w:r>
+            <w:proofErr w:type="spellStart"/>
+            <w:r>
+              <w:t>place_of_worship</w:t>
+            </w:r>
+            <w:proofErr w:type="spellEnd"/>
           </w:p>
         </w:tc>
         <w:tc>
@@ -1497,8 +2080,13 @@
             <w:tcW w:w="5100" w:type="dxa"/>
           </w:tcPr>
           <w:p>
-            <w:r>
-              <w:t>landuse=residential</w:t>
+            <w:proofErr w:type="spellStart"/>
+            <w:r>
+              <w:t>landuse</w:t>
+            </w:r>
+            <w:proofErr w:type="spellEnd"/>
+            <w:r>
+              <w:t>=residential</w:t>
             </w:r>
           </w:p>
         </w:tc>
@@ -1520,8 +2108,13 @@
           </w:tcPr>
           <w:p>
             <w:r>
-              <w:t>highway=bus_stop</w:t>
-            </w:r>
+              <w:t>highway=</w:t>
+            </w:r>
+            <w:proofErr w:type="spellStart"/>
+            <w:r>
+              <w:t>bus_stop</w:t>
+            </w:r>
+            <w:proofErr w:type="spellEnd"/>
           </w:p>
         </w:tc>
         <w:tc>
@@ -1762,8 +2355,13 @@
           </w:tcPr>
           <w:p>
             <w:r>
-              <w:t>amenity=fast_food</w:t>
-            </w:r>
+              <w:t>amenity=</w:t>
+            </w:r>
+            <w:proofErr w:type="spellStart"/>
+            <w:r>
+              <w:t>fast_food</w:t>
+            </w:r>
+            <w:proofErr w:type="spellEnd"/>
           </w:p>
         </w:tc>
         <w:tc>
@@ -1939,7 +2537,55 @@
         <w:spacing w:after="80"/>
       </w:pPr>
       <w:r>
-        <w:t>Observed monthly volume V(i,t) for outlet i in month t is the minimum of two unobserved variables: V(i,t) = min(D(i,t), C(i,t)), where D is latent consumer demand and C is systemic constraint (credit limit, stockout, delivery cap). The objective - "Maximum Monthly Purchase Potential" - is D under the assumption that constraints are relaxed.</w:t>
+        <w:t>Observed monthly volume V(</w:t>
+      </w:r>
+      <w:proofErr w:type="spellStart"/>
+      <w:proofErr w:type="gramStart"/>
+      <w:r>
+        <w:t>i,t</w:t>
+      </w:r>
+      <w:proofErr w:type="spellEnd"/>
+      <w:proofErr w:type="gramEnd"/>
+      <w:r>
+        <w:t xml:space="preserve">) for outlet </w:t>
+      </w:r>
+      <w:proofErr w:type="spellStart"/>
+      <w:r>
+        <w:t>i</w:t>
+      </w:r>
+      <w:proofErr w:type="spellEnd"/>
+      <w:r>
+        <w:t xml:space="preserve"> in month t is the minimum of two unobserved variables: V(</w:t>
+      </w:r>
+      <w:proofErr w:type="spellStart"/>
+      <w:proofErr w:type="gramStart"/>
+      <w:r>
+        <w:t>i,t</w:t>
+      </w:r>
+      <w:proofErr w:type="spellEnd"/>
+      <w:proofErr w:type="gramEnd"/>
+      <w:r>
+        <w:t>) = min(D(</w:t>
+      </w:r>
+      <w:proofErr w:type="spellStart"/>
+      <w:proofErr w:type="gramStart"/>
+      <w:r>
+        <w:t>i,t</w:t>
+      </w:r>
+      <w:proofErr w:type="spellEnd"/>
+      <w:proofErr w:type="gramEnd"/>
+      <w:r>
+        <w:t>), C(</w:t>
+      </w:r>
+      <w:proofErr w:type="spellStart"/>
+      <w:proofErr w:type="gramStart"/>
+      <w:r>
+        <w:t>i,t</w:t>
+      </w:r>
+      <w:proofErr w:type="spellEnd"/>
+      <w:proofErr w:type="gramEnd"/>
+      <w:r>
+        <w:t>)), where D is latent consumer demand and C is systemic constraint (credit limit, stockout, delivery cap). The objective - "Maximum Monthly Purchase Potential" - is D under the assumption that constraints are relaxed.</w:t>
       </w:r>
     </w:p>
     <w:p>
@@ -1977,7 +2623,15 @@
         <w:spacing w:after="0"/>
       </w:pPr>
       <w:r>
-        <w:t>zero-volume month with positive neighbours (stockout signature).</w:t>
+        <w:t xml:space="preserve">zero-volume month with positive </w:t>
+      </w:r>
+      <w:proofErr w:type="spellStart"/>
+      <w:r>
+        <w:t>neighbours</w:t>
+      </w:r>
+      <w:proofErr w:type="spellEnd"/>
+      <w:r>
+        <w:t xml:space="preserve"> (stockout signature).</w:t>
       </w:r>
     </w:p>
     <w:p>
@@ -2000,8 +2654,21 @@
         </w:numPr>
         <w:spacing w:after="0"/>
       </w:pPr>
-      <w:r>
-        <w:t>Cooler_Count = 0 with zero_months_share &gt; 0.30 (infrastructure-limited).</w:t>
+      <w:proofErr w:type="spellStart"/>
+      <w:r>
+        <w:t>Cooler_Count</w:t>
+      </w:r>
+      <w:proofErr w:type="spellEnd"/>
+      <w:r>
+        <w:t xml:space="preserve"> = 0 with </w:t>
+      </w:r>
+      <w:proofErr w:type="spellStart"/>
+      <w:r>
+        <w:t>zero_months_share</w:t>
+      </w:r>
+      <w:proofErr w:type="spellEnd"/>
+      <w:r>
+        <w:t xml:space="preserve"> &gt; 0.30 (infrastructure-limited).</w:t>
       </w:r>
     </w:p>
     <w:p>
@@ -2012,8 +2679,21 @@
         </w:numPr>
         <w:spacing w:after="0"/>
       </w:pPr>
-      <w:r>
-        <w:t xml:space="preserve">Cooler_Count = 0 AND monthly_volume below outlet's own Q90 / 3 </w:t>
+      <w:proofErr w:type="spellStart"/>
+      <w:r>
+        <w:t>Cooler_Count</w:t>
+      </w:r>
+      <w:proofErr w:type="spellEnd"/>
+      <w:r>
+        <w:t xml:space="preserve"> = 0 AND </w:t>
+      </w:r>
+      <w:proofErr w:type="spellStart"/>
+      <w:r>
+        <w:t>monthly_volume</w:t>
+      </w:r>
+      <w:proofErr w:type="spellEnd"/>
+      <w:r>
+        <w:t xml:space="preserve"> below outlet's own Q90 / 3 </w:t>
       </w:r>
     </w:p>
     <w:p>
@@ -2049,7 +2729,23 @@
         <w:spacing w:after="0"/>
       </w:pPr>
       <w:r>
-        <w:t xml:space="preserve">Group outlets by (Outlet_Type × Size × Province × poi_tier) using 4 POI rings (0.5, 1, 2, 5 km) for catchment definition. </w:t>
+        <w:t>Group outlets by (</w:t>
+      </w:r>
+      <w:proofErr w:type="spellStart"/>
+      <w:r>
+        <w:t>Outlet_Type</w:t>
+      </w:r>
+      <w:proofErr w:type="spellEnd"/>
+      <w:r>
+        <w:t xml:space="preserve"> × Size × Province × </w:t>
+      </w:r>
+      <w:proofErr w:type="spellStart"/>
+      <w:r>
+        <w:t>poi_tier</w:t>
+      </w:r>
+      <w:proofErr w:type="spellEnd"/>
+      <w:r>
+        <w:t xml:space="preserve">) using 4 POI rings (0.5, 1, 2, 5 km) for catchment definition. </w:t>
       </w:r>
     </w:p>
     <w:p>
@@ -2061,7 +2757,15 @@
         <w:spacing w:after="0"/>
       </w:pPr>
       <w:r>
-        <w:t>99.9% of outlets resolve at the finest level.</w:t>
+        <w:t xml:space="preserve">99.9% of outlets </w:t>
+      </w:r>
+      <w:proofErr w:type="gramStart"/>
+      <w:r>
+        <w:t>resolve</w:t>
+      </w:r>
+      <w:proofErr w:type="gramEnd"/>
+      <w:r>
+        <w:t xml:space="preserve"> at the finest level.</w:t>
       </w:r>
     </w:p>
     <w:p>
@@ -2074,7 +2778,23 @@
       </w:pPr>
       <w:r>
         <w:lastRenderedPageBreak/>
-        <w:t>Each outlet's base potential = max( own Q90 of unconstrained months, peer-cohort Q90 ).</w:t>
+        <w:t xml:space="preserve">Each outlet's base potential = </w:t>
+      </w:r>
+      <w:proofErr w:type="gramStart"/>
+      <w:r>
+        <w:t>max( own</w:t>
+      </w:r>
+      <w:proofErr w:type="gramEnd"/>
+      <w:r>
+        <w:t xml:space="preserve"> Q90 of unconstrained months, peer-cohort Q</w:t>
+      </w:r>
+      <w:proofErr w:type="gramStart"/>
+      <w:r>
+        <w:t>90 )</w:t>
+      </w:r>
+      <w:proofErr w:type="gramEnd"/>
+      <w:r>
+        <w:t>.</w:t>
       </w:r>
     </w:p>
     <w:p>
@@ -2086,7 +2806,15 @@
         <w:spacing w:after="0"/>
       </w:pPr>
       <w:r>
-        <w:t>Hierarchical fallback to coarser cohorts triggers when n&lt;30.</w:t>
+        <w:t xml:space="preserve">Hierarchical fallback to coarser </w:t>
+      </w:r>
+      <w:proofErr w:type="gramStart"/>
+      <w:r>
+        <w:t>cohorts</w:t>
+      </w:r>
+      <w:proofErr w:type="gramEnd"/>
+      <w:r>
+        <w:t xml:space="preserve"> triggers when n&lt;30.</w:t>
       </w:r>
     </w:p>
     <w:p>
@@ -2098,7 +2826,23 @@
         <w:spacing w:after="0"/>
       </w:pPr>
       <w:r>
-        <w:t xml:space="preserve">Step C - Projection: P̂(Jan 2026) = base × m × g × h. m is the distributor-specific seasonality multiplier calibrated empirically from the categorical Seasonality_Index ('Favorable' → 1.30-1.43× baseline; 'Un-Favorable' → 0.59-0.65×). </w:t>
+        <w:t xml:space="preserve">Step C - Projection: </w:t>
+      </w:r>
+      <w:proofErr w:type="gramStart"/>
+      <w:r>
+        <w:t>P̂(</w:t>
+      </w:r>
+      <w:proofErr w:type="gramEnd"/>
+      <w:r>
+        <w:t xml:space="preserve">Jan 2026) = base × m × g × h. m is the distributor-specific seasonality multiplier calibrated empirically from the categorical </w:t>
+      </w:r>
+      <w:proofErr w:type="spellStart"/>
+      <w:r>
+        <w:t>Seasonality_Index</w:t>
+      </w:r>
+      <w:proofErr w:type="spellEnd"/>
+      <w:r>
+        <w:t xml:space="preserve"> ('Favorable' → 1.30-1.43× baseline; 'Un-Favorable' → 0.59-0.65×). </w:t>
       </w:r>
     </w:p>
     <w:p>
@@ -2122,7 +2866,15 @@
         <w:spacing w:after="0"/>
       </w:pPr>
       <w:r>
-        <w:t>h is a holiday-count adjustment using known fixed/lunar Jan 2026 holidays (Duruthu Poya, Tamil Thai Pongal). Sanity bounds: floor = Q95 of own history; ceiling = 5 × peer cohort Q90.</w:t>
+        <w:t>h is a holiday-count adjustment using known fixed/lunar Jan 2026 holidays (</w:t>
+      </w:r>
+      <w:proofErr w:type="spellStart"/>
+      <w:r>
+        <w:t>Duruthu</w:t>
+      </w:r>
+      <w:proofErr w:type="spellEnd"/>
+      <w:r>
+        <w:t xml:space="preserve"> Poya, Tamil Thai Pongal). Sanity bounds: floor = Q95 of own history; ceiling = 5 × peer cohort Q90.</w:t>
       </w:r>
     </w:p>
     <w:p>
@@ -2176,7 +2928,15 @@
         <w:spacing w:after="0"/>
       </w:pPr>
       <w:r>
-        <w:t>(F) Stochastic Frontier Analysis (Aigner et al 1977) half-normal model `log V = X β + v - u` where v is symmetric noise and u is one-sided inefficiency; the frontier exp(X β) is potential: ρ(peer)=0.84.</w:t>
+        <w:t xml:space="preserve">(F) Stochastic Frontier Analysis (Aigner et al 1977) half-normal model `log V = X β + v - u` where v is symmetric noise and u is one-sided inefficiency; the frontier </w:t>
+      </w:r>
+      <w:proofErr w:type="gramStart"/>
+      <w:r>
+        <w:t>exp(</w:t>
+      </w:r>
+      <w:proofErr w:type="gramEnd"/>
+      <w:r>
+        <w:t>X β) is potential: ρ(peer)=0.84.</w:t>
       </w:r>
     </w:p>
     <w:p>
@@ -2188,7 +2948,15 @@
         <w:spacing w:after="80"/>
       </w:pPr>
       <w:r>
-        <w:t>All four pairwise Spearman exceed 0.75 → 4-way ensemble 0.40 peer-Q90 + 0.20 log-linear + 0.20 Tobit + 0.20 SFA (peer-Q90 anchor weight as the only non-parametric method).</w:t>
+        <w:t xml:space="preserve">All four pairwise Spearman </w:t>
+      </w:r>
+      <w:proofErr w:type="gramStart"/>
+      <w:r>
+        <w:t>exceed</w:t>
+      </w:r>
+      <w:proofErr w:type="gramEnd"/>
+      <w:r>
+        <w:t xml:space="preserve"> 0.75 → 4-way ensemble 0.40 peer-Q90 + 0.20 log-linear + 0.20 Tobit + 0.20 SFA (peer-Q90 anchor weight as the only non-parametric method).</w:t>
       </w:r>
     </w:p>
     <w:p>
@@ -2331,10 +3099,7 @@
           </w:tcPr>
           <w:p>
             <w:r>
-              <w:t>0.063 (</w:t>
-            </w:r>
-            <w:r>
-              <w:t>p=1.47e-16)</w:t>
+              <w:t>0.063 (p=1.47e-16)</w:t>
             </w:r>
           </w:p>
         </w:tc>
@@ -2371,7 +3136,15 @@
           </w:tcPr>
           <w:p>
             <w:r>
-              <w:t>Peer-fallback Level-0 outlet share</w:t>
+              <w:t xml:space="preserve">Peer-fallback </w:t>
+            </w:r>
+            <w:proofErr w:type="gramStart"/>
+            <w:r>
+              <w:t>Level-0</w:t>
+            </w:r>
+            <w:proofErr w:type="gramEnd"/>
+            <w:r>
+              <w:t xml:space="preserve"> outlet share</w:t>
             </w:r>
           </w:p>
         </w:tc>
@@ -2406,7 +3179,27 @@
           <w:sz w:val="16"/>
           <w:szCs w:val="16"/>
         </w:rPr>
-        <w:t>References: Tobin 1958 (censored regression); Amemiya 1984 (Tobit family); Koenker &amp; Bassett 1978 (quantile regression); Buchinsky 1998 (quantile-regression developments); Greene 2008, Econometric Analysis, chap. 19.</w:t>
+        <w:t xml:space="preserve">References: Tobin 1958 (censored regression); Amemiya 1984 (Tobit family); </w:t>
+      </w:r>
+      <w:proofErr w:type="spellStart"/>
+      <w:r>
+        <w:rPr>
+          <w:i/>
+          <w:iCs/>
+          <w:sz w:val="16"/>
+          <w:szCs w:val="16"/>
+        </w:rPr>
+        <w:t>Koenker</w:t>
+      </w:r>
+      <w:proofErr w:type="spellEnd"/>
+      <w:r>
+        <w:rPr>
+          <w:i/>
+          <w:iCs/>
+          <w:sz w:val="16"/>
+          <w:szCs w:val="16"/>
+        </w:rPr>
+        <w:t xml:space="preserve"> &amp; Bassett 1978 (quantile regression); Buchinsky 1998 (quantile-regression developments); Greene 2008, Econometric Analysis, chap. 19.</w:t>
       </w:r>
     </w:p>
     <w:p>
@@ -2428,7 +3221,51 @@
         <w:spacing w:after="80"/>
       </w:pPr>
       <w:r>
-        <w:t>Outlets are ranked by predicted-vs-observed uplift (with extra weight when Cooler_Count = 0). The Top-100 list (outputs/audit/top100_outlets_priority.csv) represents ~100,374 L / month of currently-uncapped demand,  concentrated in outlets without cold-storage. This is the natural cooler-deployment and trade-marketing target. A Sri Lanka outlet potential map and per-province bars are saved as audit PNGs.</w:t>
+        <w:t xml:space="preserve">Outlets are ranked by predicted-vs-observed uplift (with extra weight when </w:t>
+      </w:r>
+      <w:proofErr w:type="spellStart"/>
+      <w:r>
+        <w:t>Cooler_Count</w:t>
+      </w:r>
+      <w:proofErr w:type="spellEnd"/>
+      <w:r>
+        <w:t xml:space="preserve"> = 0). The </w:t>
+      </w:r>
+      <w:proofErr w:type="gramStart"/>
+      <w:r>
+        <w:t>Top-100</w:t>
+      </w:r>
+      <w:proofErr w:type="gramEnd"/>
+      <w:r>
+        <w:t xml:space="preserve"> list (outputs/audit/top100_outlets_priority.csv) represents ~</w:t>
+      </w:r>
+      <w:r>
+        <w:t>107,695</w:t>
+      </w:r>
+      <w:r>
+        <w:t xml:space="preserve"> </w:t>
+      </w:r>
+      <w:r>
+        <w:t>L</w:t>
+      </w:r>
+      <w:r>
+        <w:t xml:space="preserve"> / month of </w:t>
+      </w:r>
+      <w:proofErr w:type="gramStart"/>
+      <w:r>
+        <w:t>currently-uncapped</w:t>
+      </w:r>
+      <w:proofErr w:type="gramEnd"/>
+      <w:r>
+        <w:t xml:space="preserve"> </w:t>
+      </w:r>
+      <w:proofErr w:type="gramStart"/>
+      <w:r>
+        <w:t>demand,  concentrated</w:t>
+      </w:r>
+      <w:proofErr w:type="gramEnd"/>
+      <w:r>
+        <w:t xml:space="preserve"> in outlets without cold-storage. This is the natural cooler-deployment and trade-marketing target. A Sri Lanka outlet potential map and per-province bars are saved as audit PNGs.</w:t>
       </w:r>
     </w:p>
     <w:p>
@@ -2458,7 +3295,15 @@
         <w:spacing w:after="80"/>
       </w:pPr>
       <w:r>
-        <w:t>(2) OpenStreetMap rural coverage is uneven; within-province POI-tier normalisation reduces but does not eliminate the bias.</w:t>
+        <w:t xml:space="preserve">(2) OpenStreetMap rural coverage is uneven; within-province POI-tier </w:t>
+      </w:r>
+      <w:proofErr w:type="spellStart"/>
+      <w:r>
+        <w:t>normalisation</w:t>
+      </w:r>
+      <w:proofErr w:type="spellEnd"/>
+      <w:r>
+        <w:t xml:space="preserve"> reduces but does not eliminate the bias.</w:t>
       </w:r>
     </w:p>
     <w:p>
@@ -2477,7 +3322,31 @@
         </w:rPr>
       </w:pPr>
       <w:r>
-        <w:t>(4) The Seasonality_Index for January 2026 is extrapolated from 2023-2025 Januaries via majority vote per distributor (all distributors had identical labels across years so this is robust).</w:t>
+        <w:t xml:space="preserve">(4) The </w:t>
+      </w:r>
+      <w:proofErr w:type="spellStart"/>
+      <w:r>
+        <w:t>Seasonality_Index</w:t>
+      </w:r>
+      <w:proofErr w:type="spellEnd"/>
+      <w:r>
+        <w:t xml:space="preserve"> for January 2026 is extrapolated from 2023-2025 </w:t>
+      </w:r>
+      <w:proofErr w:type="spellStart"/>
+      <w:r>
+        <w:t>Januaries</w:t>
+      </w:r>
+      <w:proofErr w:type="spellEnd"/>
+      <w:r>
+        <w:t xml:space="preserve"> via majority vote per distributor (all distributors had identical labels across </w:t>
+      </w:r>
+      <w:proofErr w:type="gramStart"/>
+      <w:r>
+        <w:t>years</w:t>
+      </w:r>
+      <w:proofErr w:type="gramEnd"/>
+      <w:r>
+        <w:t xml:space="preserve"> so this is robust).</w:t>
       </w:r>
     </w:p>
     <w:p>
@@ -2500,7 +3369,15 @@
         <w:spacing w:after="80"/>
       </w:pPr>
       <w:r>
-        <w:t xml:space="preserve">Every design decision in this submission came from the team. We chose statistical estimation over supervised ML once we saw the problem statement clearly rules out a target variable. We laid out the Bronze, Silver and Gold layers ourselves because the rubric calls for it explicitly. We defined the peer cohort, wrote the constraint rules, picked the sanity bounds, and decided what limitations to surface honestly in this report. The AI assistant (Claude Code) helped us move faster on specified tasks: writing boilerplate code, debugging tracebacks, and looking up the right citation when we needed one. </w:t>
+        <w:t xml:space="preserve">Every design decision in this submission came from the team. We chose statistical estimation over supervised ML once we saw the problem statement clearly rules out a target variable. We laid out the </w:t>
+      </w:r>
+      <w:proofErr w:type="gramStart"/>
+      <w:r>
+        <w:t>Bronze, Silver and Gold</w:t>
+      </w:r>
+      <w:proofErr w:type="gramEnd"/>
+      <w:r>
+        <w:t xml:space="preserve"> layers ourselves because the rubric calls for it explicitly. We defined the peer cohort, wrote the constraint rules, picked the sanity bounds, and decided what limitations to surface honestly in this report. The AI assistant (Claude Code) helped us move faster on specified tasks: writing boilerplate code, debugging tracebacks, and looking up the right citation when we needed one. </w:t>
       </w:r>
     </w:p>
     <w:p>
@@ -2743,7 +3620,15 @@
           </w:tcPr>
           <w:p>
             <w:r>
-              <w:t>“Reusable check_duplicates returning (clean, rejected) sets”</w:t>
+              <w:t xml:space="preserve">“Reusable </w:t>
+            </w:r>
+            <w:proofErr w:type="spellStart"/>
+            <w:r>
+              <w:t>check_duplicates</w:t>
+            </w:r>
+            <w:proofErr w:type="spellEnd"/>
+            <w:r>
+              <w:t xml:space="preserve"> returning (clean, rejected) sets”</w:t>
             </w:r>
           </w:p>
         </w:tc>
@@ -2837,7 +3722,15 @@
           </w:tcPr>
           <w:p>
             <w:r>
-              <w:t>Accepted with caveat. None found (n=0); logged as 'none_found'.</w:t>
+              <w:t>Accepted with caveat. None found (n=0); logged as '</w:t>
+            </w:r>
+            <w:proofErr w:type="spellStart"/>
+            <w:r>
+              <w:t>none_found</w:t>
+            </w:r>
+            <w:proofErr w:type="spellEnd"/>
+            <w:r>
+              <w:t>'.</w:t>
             </w:r>
           </w:p>
         </w:tc>
@@ -2878,8 +3771,29 @@
             <w:tcW w:w="4320" w:type="dxa"/>
           </w:tcPr>
           <w:p>
-            <w:r>
-              <w:t>REJECTED.Same date has multiple Holiday_Type. PK = (Date, Holiday_Type).</w:t>
+            <w:proofErr w:type="spellStart"/>
+            <w:r>
+              <w:t>REJECTED.Same</w:t>
+            </w:r>
+            <w:proofErr w:type="spellEnd"/>
+            <w:r>
+              <w:t xml:space="preserve"> date has multiple </w:t>
+            </w:r>
+            <w:proofErr w:type="spellStart"/>
+            <w:r>
+              <w:t>Holiday_Type</w:t>
+            </w:r>
+            <w:proofErr w:type="spellEnd"/>
+            <w:r>
+              <w:t xml:space="preserve">. PK = (Date, </w:t>
+            </w:r>
+            <w:proofErr w:type="spellStart"/>
+            <w:r>
+              <w:t>Holiday_Type</w:t>
+            </w:r>
+            <w:proofErr w:type="spellEnd"/>
+            <w:r>
+              <w:t>).</w:t>
             </w:r>
           </w:p>
         </w:tc>
@@ -2911,7 +3825,23 @@
           </w:tcPr>
           <w:p>
             <w:r>
-              <w:t>"Normalise Outlet_Type typos and log correction count"</w:t>
+              <w:t>"</w:t>
+            </w:r>
+            <w:proofErr w:type="spellStart"/>
+            <w:r>
+              <w:t>Normalise</w:t>
+            </w:r>
+            <w:proofErr w:type="spellEnd"/>
+            <w:r>
+              <w:t xml:space="preserve"> </w:t>
+            </w:r>
+            <w:proofErr w:type="spellStart"/>
+            <w:r>
+              <w:t>Outlet_Type</w:t>
+            </w:r>
+            <w:proofErr w:type="spellEnd"/>
+            <w:r>
+              <w:t xml:space="preserve"> typos and log correction count"</w:t>
             </w:r>
           </w:p>
         </w:tc>
@@ -2958,7 +3888,55 @@
         </w:rPr>
       </w:pPr>
       <w:r>
-        <w:t xml:space="preserve">First, the AI initially suggested using Date alone as the primary key for the holiday list. When we tried that, almost 99% of rows were flagged as duplicates, because the same date legitimately appears with Public, Bank and Mercantile categories. We changed the key to (Date, Holiday_Type) and the duplicate rate fell to a sensible 56.73%, which we found are real repeated entries left over from the legacy export.Second, the typo counter for Outlet_Type was over-reporting: it counted every row whose post-normalisation value happened to match a canonical label, including rows that were already correct. We fixed the logic to count only rows whose value actually changed, which brought the number from a misleading 5,958 down to the true </w:t>
+        <w:t xml:space="preserve">First, </w:t>
+      </w:r>
+      <w:proofErr w:type="gramStart"/>
+      <w:r>
+        <w:t>the AI</w:t>
+      </w:r>
+      <w:proofErr w:type="gramEnd"/>
+      <w:r>
+        <w:t xml:space="preserve"> initially suggested using Date alone as the primary key for the holiday list. When we tried that, almost 99% of rows were flagged as duplicates, because the same date legitimately appears with Public, Bank and Mercantile categories. We changed the key to (Date, </w:t>
+      </w:r>
+      <w:proofErr w:type="spellStart"/>
+      <w:r>
+        <w:t>Holiday_Type</w:t>
+      </w:r>
+      <w:proofErr w:type="spellEnd"/>
+      <w:r>
+        <w:t xml:space="preserve">) and the duplicate rate fell to a sensible 56.73%, which we found are real repeated entries left over from the legacy </w:t>
+      </w:r>
+      <w:proofErr w:type="spellStart"/>
+      <w:r>
+        <w:t>export.Second</w:t>
+      </w:r>
+      <w:proofErr w:type="spellEnd"/>
+      <w:r>
+        <w:t xml:space="preserve">, the typo counter for </w:t>
+      </w:r>
+      <w:proofErr w:type="spellStart"/>
+      <w:r>
+        <w:t>Outlet_Type</w:t>
+      </w:r>
+      <w:proofErr w:type="spellEnd"/>
+      <w:r>
+        <w:t xml:space="preserve"> was over-reporting: it counted every row whose post-</w:t>
+      </w:r>
+      <w:proofErr w:type="spellStart"/>
+      <w:r>
+        <w:t>normalisation</w:t>
+      </w:r>
+      <w:proofErr w:type="spellEnd"/>
+      <w:r>
+        <w:t xml:space="preserve"> value happened to match a canonical label, including rows that were already correct. We fixed the logic to count only rows whose value </w:t>
+      </w:r>
+      <w:proofErr w:type="gramStart"/>
+      <w:r>
+        <w:t>actually changed</w:t>
+      </w:r>
+      <w:proofErr w:type="gramEnd"/>
+      <w:r>
+        <w:t xml:space="preserve">, which brought the number from a misleading 5,958 down to the true </w:t>
       </w:r>
       <w:r>
         <w:t>979</w:t>
@@ -2990,7 +3968,31 @@
         </w:rPr>
       </w:pPr>
       <w:r>
-        <w:t>The reusable parameterised DQ functions in src/dq_checks.py were drafted by the AI once we had decided on the five check types, which saved us maybe two hours of boilerplate. The Overpass API client with retry-with-backoff and JSON caching, and the BallTree spatial join with haversine in radians, came together quickly because the AI knew the right idioms. And during a tricky moment in Phase 5 the AI surfaced the right set of references (Tobit 1958, Buchinsky 1998, Koenker and Bassett 1978) so we could frame the causal logic on solid ground. We checked the citations and the convergence numbers ourselves before they went into this report.</w:t>
+        <w:t xml:space="preserve">The reusable </w:t>
+      </w:r>
+      <w:proofErr w:type="spellStart"/>
+      <w:r>
+        <w:t>parameterised</w:t>
+      </w:r>
+      <w:proofErr w:type="spellEnd"/>
+      <w:r>
+        <w:t xml:space="preserve"> DQ functions in src/dq_checks.py were drafted by the AI once we had decided on the five check types, which saved us maybe two hours of boilerplate. The Overpass API client with retry-with-backoff and JSON caching, and the </w:t>
+      </w:r>
+      <w:proofErr w:type="spellStart"/>
+      <w:r>
+        <w:t>BallTree</w:t>
+      </w:r>
+      <w:proofErr w:type="spellEnd"/>
+      <w:r>
+        <w:t xml:space="preserve"> spatial join with haversine in radians, came together quickly because the AI knew the right idioms. And during a tricky moment in Phase 5 the AI surfaced the right set of references (Tobit 1958, Buchinsky 1998, </w:t>
+      </w:r>
+      <w:proofErr w:type="spellStart"/>
+      <w:r>
+        <w:t>Koenker</w:t>
+      </w:r>
+      <w:proofErr w:type="spellEnd"/>
+      <w:r>
+        <w:t xml:space="preserve"> and Bassett 1978) so we could frame the causal logic on solid ground. We checked the citations and the convergence numbers ourselves before they went into this report.</w:t>
       </w:r>
     </w:p>
     <w:sectPr>

</xml_diff>